<commit_message>
The assignment document for the thesis have been updated
</commit_message>
<xml_diff>
--- a/src/main/resources/Заполнители/ВКР/common/Задание_на_ВКР.docx
+++ b/src/main/resources/Заполнители/ВКР/common/Задание_на_ВКР.docx
@@ -264,11 +264,16 @@
               </w:numPr>
               <w:spacing w:lineRule="auto" w:line="276"/>
               <w:jc w:val="end"/>
-              <w:rPr/>
-            </w:pPr>
-            <w:r>
-              <w:rPr/>
-              <w:t>«……»…………………20…г.</w:t>
+              <w:rPr>
+                <w:highlight w:val="none"/>
+                <w:shd w:fill="FFFF00" w:val="clear"/>
+              </w:rPr>
+            </w:pPr>
+            <w:r>
+              <w:rPr>
+                <w:shd w:fill="FFFF00" w:val="clear"/>
+              </w:rPr>
+              <w:t>$(общаяДатаПодписи)</w:t>
             </w:r>
           </w:p>
         </w:tc>
@@ -484,8 +489,8 @@
         <w:tblLook w:val="04a0" w:noHBand="0" w:noVBand="1" w:firstColumn="1" w:lastRow="0" w:lastColumn="0" w:firstRow="1"/>
       </w:tblPr>
       <w:tblGrid>
-        <w:gridCol w:w="5629"/>
-        <w:gridCol w:w="3726"/>
+        <w:gridCol w:w="5627"/>
+        <w:gridCol w:w="3728"/>
       </w:tblGrid>
       <w:tr>
         <w:trPr/>
@@ -503,7 +508,53 @@
             </w:pPr>
             <w:r>
               <w:rPr/>
-              <w:t xml:space="preserve">утверждена распоряжением проректора по учебной работе от…………………№…… </w:t>
+              <w:t xml:space="preserve">утверждена распоряжением проректора по учебной работе </w:t>
+            </w:r>
+            <w:r>
+              <w:rPr>
+                <w:shd w:fill="FFFF00" w:val="clear"/>
+              </w:rPr>
+              <w:t>$(</w:t>
+            </w:r>
+            <w:bookmarkStart w:id="0" w:name="__DdeLink__132_3726743086"/>
+            <w:r>
+              <w:rPr>
+                <w:shd w:fill="FFFF00" w:val="clear"/>
+              </w:rPr>
+              <w:t>утверждениеТемы</w:t>
+            </w:r>
+            <w:bookmarkEnd w:id="0"/>
+            <w:r>
+              <w:rPr>
+                <w:shd w:fill="FFFF00" w:val="clear"/>
+              </w:rPr>
+              <w:t>)</w:t>
+            </w:r>
+            <w:r>
+              <w:rPr/>
+              <w:t xml:space="preserve"> </w:t>
+            </w:r>
+            <w:r>
+              <w:rPr>
+                <w:shd w:fill="FFFF00" w:val="clear"/>
+              </w:rPr>
+              <w:t>$(корректировкаТемы</w:t>
+            </w:r>
+            <w:r>
+              <w:rPr>
+                <w:shd w:fill="FFFF00" w:val="clear"/>
+              </w:rPr>
+              <w:t>ЕслиЕсть</w:t>
+            </w:r>
+            <w:r>
+              <w:rPr>
+                <w:shd w:fill="FFFF00" w:val="clear"/>
+              </w:rPr>
+              <w:t>)</w:t>
+            </w:r>
+            <w:r>
+              <w:rPr/>
+              <w:t xml:space="preserve"> </w:t>
             </w:r>
           </w:p>
         </w:tc>
@@ -524,7 +575,13 @@
             </w:pPr>
             <w:r>
               <w:rPr/>
-              <w:t>Срок сдачи студентом готовой работы………………………20.. г.</w:t>
+              <w:t xml:space="preserve">Срок сдачи студентом готовой работы </w:t>
+            </w:r>
+            <w:r>
+              <w:rPr>
+                <w:shd w:fill="FFFF00" w:val="clear"/>
+              </w:rPr>
+              <w:t>$(срокСдачиРаботы)</w:t>
             </w:r>
           </w:p>
         </w:tc>
@@ -659,7 +716,7 @@
         <w:trPr/>
         <w:tc>
           <w:tcPr>
-            <w:tcW w:w="5629" w:type="dxa"/>
+            <w:tcW w:w="5627" w:type="dxa"/>
             <w:tcBorders/>
             <w:shd w:color="auto" w:fill="auto" w:val="clear"/>
           </w:tcPr>
@@ -676,7 +733,7 @@
         </w:tc>
         <w:tc>
           <w:tcPr>
-            <w:tcW w:w="3726" w:type="dxa"/>
+            <w:tcW w:w="3728" w:type="dxa"/>
             <w:tcBorders/>
             <w:shd w:color="auto" w:fill="auto" w:val="clear"/>
           </w:tcPr>
@@ -697,7 +754,7 @@
         <w:trPr/>
         <w:tc>
           <w:tcPr>
-            <w:tcW w:w="5629" w:type="dxa"/>
+            <w:tcW w:w="5627" w:type="dxa"/>
             <w:tcBorders/>
             <w:shd w:color="auto" w:fill="auto" w:val="clear"/>
           </w:tcPr>
@@ -730,7 +787,7 @@
         </w:tc>
         <w:tc>
           <w:tcPr>
-            <w:tcW w:w="3726" w:type="dxa"/>
+            <w:tcW w:w="3728" w:type="dxa"/>
             <w:tcBorders/>
             <w:shd w:color="auto" w:fill="auto" w:val="clear"/>
           </w:tcPr>
@@ -758,7 +815,7 @@
         <w:trPr/>
         <w:tc>
           <w:tcPr>
-            <w:tcW w:w="5629" w:type="dxa"/>
+            <w:tcW w:w="5627" w:type="dxa"/>
             <w:tcBorders/>
             <w:shd w:color="auto" w:fill="auto" w:val="clear"/>
           </w:tcPr>
@@ -787,7 +844,7 @@
         </w:tc>
         <w:tc>
           <w:tcPr>
-            <w:tcW w:w="3726" w:type="dxa"/>
+            <w:tcW w:w="3728" w:type="dxa"/>
             <w:tcBorders/>
             <w:shd w:color="auto" w:fill="auto" w:val="clear"/>
           </w:tcPr>
@@ -813,7 +870,7 @@
         <w:trPr/>
         <w:tc>
           <w:tcPr>
-            <w:tcW w:w="5629" w:type="dxa"/>
+            <w:tcW w:w="5627" w:type="dxa"/>
             <w:tcBorders/>
             <w:shd w:color="auto" w:fill="auto" w:val="clear"/>
           </w:tcPr>
@@ -834,7 +891,7 @@
         </w:tc>
         <w:tc>
           <w:tcPr>
-            <w:tcW w:w="3726" w:type="dxa"/>
+            <w:tcW w:w="3728" w:type="dxa"/>
             <w:tcBorders/>
             <w:shd w:color="auto" w:fill="auto" w:val="clear"/>
           </w:tcPr>
@@ -842,11 +899,16 @@
             <w:pPr>
               <w:pStyle w:val="Normal"/>
               <w:ind w:hanging="0"/>
-              <w:rPr/>
-            </w:pPr>
-            <w:r>
-              <w:rPr/>
-              <w:t>«…»…………………20…г.</w:t>
+              <w:rPr>
+                <w:highlight w:val="none"/>
+                <w:shd w:fill="FFFF00" w:val="clear"/>
+              </w:rPr>
+            </w:pPr>
+            <w:r>
+              <w:rPr>
+                <w:shd w:fill="FFFF00" w:val="clear"/>
+              </w:rPr>
+              <w:t>$(общаяДатаПодписи)</w:t>
             </w:r>
           </w:p>
         </w:tc>
@@ -857,7 +919,7 @@
         </w:trPr>
         <w:tc>
           <w:tcPr>
-            <w:tcW w:w="5629" w:type="dxa"/>
+            <w:tcW w:w="5627" w:type="dxa"/>
             <w:tcBorders/>
             <w:shd w:color="auto" w:fill="auto" w:val="clear"/>
           </w:tcPr>
@@ -884,7 +946,7 @@
         </w:tc>
         <w:tc>
           <w:tcPr>
-            <w:tcW w:w="3726" w:type="dxa"/>
+            <w:tcW w:w="3728" w:type="dxa"/>
             <w:tcBorders/>
             <w:shd w:color="auto" w:fill="auto" w:val="clear"/>
           </w:tcPr>
@@ -905,24 +967,31 @@
         </w:trPr>
         <w:tc>
           <w:tcPr>
-            <w:tcW w:w="5629" w:type="dxa"/>
+            <w:tcW w:w="5627" w:type="dxa"/>
             <w:tcBorders/>
             <w:shd w:color="auto" w:fill="auto" w:val="clear"/>
           </w:tcPr>
           <w:p>
             <w:pPr>
               <w:pStyle w:val="Normal"/>
-              <w:rPr/>
-            </w:pPr>
-            <w:r>
-              <w:rPr/>
-              <w:t>«…»…………………20…г.</w:t>
-            </w:r>
+              <w:rPr>
+                <w:highlight w:val="none"/>
+                <w:shd w:fill="FFFF00" w:val="clear"/>
+              </w:rPr>
+            </w:pPr>
+            <w:bookmarkStart w:id="1" w:name="__DdeLink__131_2351069225"/>
+            <w:r>
+              <w:rPr>
+                <w:shd w:fill="FFFF00" w:val="clear"/>
+              </w:rPr>
+              <w:t>$(общаяДатаПодписи)</w:t>
+            </w:r>
+            <w:bookmarkEnd w:id="1"/>
           </w:p>
         </w:tc>
         <w:tc>
           <w:tcPr>
-            <w:tcW w:w="3726" w:type="dxa"/>
+            <w:tcW w:w="3728" w:type="dxa"/>
             <w:tcBorders/>
             <w:shd w:color="auto" w:fill="auto" w:val="clear"/>
           </w:tcPr>
@@ -943,7 +1012,7 @@
         </w:trPr>
         <w:tc>
           <w:tcPr>
-            <w:tcW w:w="5629" w:type="dxa"/>
+            <w:tcW w:w="5627" w:type="dxa"/>
             <w:tcBorders/>
             <w:shd w:color="auto" w:fill="auto" w:val="clear"/>
           </w:tcPr>
@@ -959,7 +1028,7 @@
         </w:tc>
         <w:tc>
           <w:tcPr>
-            <w:tcW w:w="3726" w:type="dxa"/>
+            <w:tcW w:w="3728" w:type="dxa"/>
             <w:tcBorders/>
             <w:shd w:color="auto" w:fill="auto" w:val="clear"/>
           </w:tcPr>
@@ -980,7 +1049,7 @@
         </w:trPr>
         <w:tc>
           <w:tcPr>
-            <w:tcW w:w="5629" w:type="dxa"/>
+            <w:tcW w:w="5627" w:type="dxa"/>
             <w:tcBorders/>
             <w:shd w:color="auto" w:fill="auto" w:val="clear"/>
           </w:tcPr>
@@ -998,13 +1067,29 @@
                 <w:color w:val="auto"/>
                 <w:shd w:fill="FFFF00" w:val="clear"/>
               </w:rPr>
-              <w:t>$(соруководительЗадание)</w:t>
+              <w:t>$(</w:t>
+            </w:r>
+            <w:bookmarkStart w:id="2" w:name="__DdeLink__129_2351069225"/>
+            <w:r>
+              <w:rPr>
+                <w:color w:val="auto"/>
+                <w:shd w:fill="FFFF00" w:val="clear"/>
+              </w:rPr>
+              <w:t>соруководительЗадание</w:t>
+            </w:r>
+            <w:bookmarkEnd w:id="2"/>
+            <w:r>
+              <w:rPr>
+                <w:color w:val="auto"/>
+                <w:shd w:fill="FFFF00" w:val="clear"/>
+              </w:rPr>
+              <w:t>)</w:t>
             </w:r>
           </w:p>
         </w:tc>
         <w:tc>
           <w:tcPr>
-            <w:tcW w:w="3726" w:type="dxa"/>
+            <w:tcW w:w="3728" w:type="dxa"/>
             <w:tcBorders/>
             <w:shd w:color="auto" w:fill="auto" w:val="clear"/>
           </w:tcPr>

</xml_diff>